<commit_message>
style: burner price schedule back to heading-only
Burner price cell shows just the bold heading (no description paragraph, no
colon) as discussed. Blower keeps its heading + description paragraph. The
price-cell body/colon is now gated to the blower only in
_generate_equipment_offer.

Co-Authored-By: Claude Opus 4.8 <noreply@anthropic.com>
</commit_message>
<xml_diff>
--- a/Burner_Offer_Template.docx
+++ b/Burner_Offer_Template.docx
@@ -2739,15 +2739,6 @@
                 <w:b/>
               </w:rPr>
               <w:t>{{ price_heading }}</w:t>
-            </w:r>
-          </w:p>
-          <w:p>
-            <w:r>
-              <w:rPr>
-                <w:rFonts w:ascii="Calibri" w:hAnsi="Calibri"/>
-                <w:b w:val="0"/>
-              </w:rPr>
-              <w:t>{{ price_body }}</w:t>
             </w:r>
           </w:p>
           <w:p>

</xml_diff>